<commit_message>
Tighten spacing in professional templates
</commit_message>
<xml_diff>
--- a/templates/carta_profesional.docx
+++ b/templates/carta_profesional.docx
@@ -47,18 +47,6 @@
     </w:p>
     <w:p>
       <w:pPr>
-        <w:jc w:val="center"/>
-        <w:rPr>
-          <w:b/>
-          <w:bCs/>
-          <w:sz w:val="24"/>
-          <w:szCs w:val="24"/>
-        </w:rPr>
-      </w:pPr>
-    </w:p>
-    <w:p>
-      <w:pPr>
-        <w:jc w:val="center"/>
         <w:rPr>
           <w:b/>
           <w:bCs/>

</xml_diff>

<commit_message>
Adjust professional letter template cc block
</commit_message>
<xml_diff>
--- a/templates/carta_profesional.docx
+++ b/templates/carta_profesional.docx
@@ -124,10 +124,14 @@
     <w:p/>
     <w:p>
       <w:r>
+        <w:t>C.c.:</w:t>
+      </w:r>
+    </w:p>
+    <w:p>
+      <w:r>
         <w:t>{{CC_BLOCK}}</w:t>
       </w:r>
     </w:p>
-    <w:p/>
     <w:p>
       <w:r>
         <w:t>{{FOOTER_BLOCK}}</w:t>

</xml_diff>